<commit_message>
Update budget details and add new SF-424 answers PDF for CDC-RFA-JG-26-0056 application
Revise Year 1 budget section in application_answers.md and related scripts to reflect a total federal ask of $7,500,000, with detailed component allocations. Introduce a new PDF document containing fillable answers for the SF-424 form, ensuring compliance with Grants.gov requirements. Update existing documents to align with the revised budget and application details.
</commit_message>
<xml_diff>
--- a/applications/cdc-ghs-global/documents/cdc-ghs-global_word.docx
+++ b/applications/cdc-ghs-global/documents/cdc-ghs-global_word.docx
@@ -489,7 +489,7 @@
                 <w:color w:val="1E2F38"/>
                 <w:sz w:val="20"/>
               </w:rPr>
-              <w:t>Year 1 total federal ask (draft)</w:t>
+              <w:t>Year 1 total federal ask (feasible)</w:t>
             </w:r>
           </w:p>
         </w:tc>
@@ -507,7 +507,7 @@
                 <w:color w:val="1E2F38"/>
                 <w:sz w:val="20"/>
               </w:rPr>
-              <w:t>$3,200,000 (CONFIRM; components 1-4)</w:t>
+              <w:t>$7,500,000 (C1-C5; Box 18)</w:t>
             </w:r>
           </w:p>
         </w:tc>
@@ -527,7 +527,7 @@
                 <w:color w:val="1E2F38"/>
                 <w:sz w:val="20"/>
               </w:rPr>
-              <w:t>Year 1 Component 1 ask (draft)</w:t>
+              <w:t>Year 1 Component 1 ask (feasible)</w:t>
             </w:r>
           </w:p>
         </w:tc>
@@ -545,7 +545,7 @@
                 <w:color w:val="1E2F38"/>
                 <w:sz w:val="20"/>
               </w:rPr>
-              <w:t>$2,200,000 (CONFIRM; ceiling $3,000,000)</w:t>
+              <w:t>$3,000,000 (NOFO estimate / full ceiling)</w:t>
             </w:r>
           </w:p>
         </w:tc>
@@ -2004,7 +2004,7 @@
           <w:color w:val="1E2F38"/>
           <w:sz w:val="24"/>
         </w:rPr>
-        <w:t>7. Draft Year 1 component budgets (CONFIRM before submit)</w:t>
+        <w:t>7. Feasible Year 1 component budgets (CONFIRM before submit)</w:t>
       </w:r>
     </w:p>
     <w:tbl>
@@ -2130,7 +2130,7 @@
                 <w:color w:val="1E2F38"/>
                 <w:sz w:val="20"/>
               </w:rPr>
-              <w:t>$2,200,000</w:t>
+              <w:t>$3,000,000</w:t>
             </w:r>
           </w:p>
         </w:tc>
@@ -2166,7 +2166,7 @@
                 <w:color w:val="1E2F38"/>
                 <w:sz w:val="20"/>
               </w:rPr>
-              <w:t>Expected initial funding</w:t>
+              <w:t>Expected initial funding (full ceiling)</w:t>
             </w:r>
           </w:p>
         </w:tc>
@@ -2204,7 +2204,7 @@
                 <w:color w:val="1E2F38"/>
                 <w:sz w:val="20"/>
               </w:rPr>
-              <w:t>$350,000</w:t>
+              <w:t>$1,000,000</w:t>
             </w:r>
           </w:p>
         </w:tc>
@@ -2278,7 +2278,7 @@
                 <w:color w:val="1E2F38"/>
                 <w:sz w:val="20"/>
               </w:rPr>
-              <w:t>$400,000</w:t>
+              <w:t>$1,500,000</w:t>
             </w:r>
           </w:p>
         </w:tc>
@@ -2352,7 +2352,7 @@
                 <w:color w:val="1E2F38"/>
                 <w:sz w:val="20"/>
               </w:rPr>
-              <w:t>$250,000</w:t>
+              <w:t>$1,000,000</w:t>
             </w:r>
           </w:p>
         </w:tc>
@@ -2426,7 +2426,7 @@
                 <w:color w:val="1E2F38"/>
                 <w:sz w:val="20"/>
               </w:rPr>
-              <w:t>ABU playbook</w:t>
+              <w:t>$1,000,000</w:t>
             </w:r>
           </w:p>
         </w:tc>
@@ -2462,7 +2462,7 @@
                 <w:color w:val="1E2F38"/>
                 <w:sz w:val="20"/>
               </w:rPr>
-              <w:t>Narrative + CONFIRM SF-424A</w:t>
+              <w:t>Contingency ABU</w:t>
             </w:r>
           </w:p>
         </w:tc>
@@ -2482,7 +2482,7 @@
                 <w:color w:val="1E2F38"/>
                 <w:sz w:val="20"/>
               </w:rPr>
-              <w:t>TOTAL Year 1 (draft C1-C4)</w:t>
+              <w:t>TOTAL Year 1 (feasible C1-C5)</w:t>
             </w:r>
           </w:p>
         </w:tc>
@@ -2500,7 +2500,7 @@
                 <w:color w:val="1E2F38"/>
                 <w:sz w:val="20"/>
               </w:rPr>
-              <w:t>$3,200,000</w:t>
+              <w:t>$7,500,000</w:t>
             </w:r>
           </w:p>
         </w:tc>
@@ -2535,7 +2535,7 @@
                 <w:color w:val="1E2F38"/>
                 <w:sz w:val="20"/>
               </w:rPr>
-              <w:t>Equals Box 18a when final</w:t>
+              <w:t>Equals Box 18a / 18g</w:t>
             </w:r>
           </w:p>
         </w:tc>
@@ -2719,7 +2719,7 @@
           <w:color w:val="52636C"/>
           <w:sz w:val="20"/>
         </w:rPr>
-        <w:t>Full copy-paste bank: application_answers.md. Generated 2026-08-10.</w:t>
+        <w:t>Full copy-paste bank: application_answers.md. Generated 2026-08-11.</w:t>
       </w:r>
     </w:p>
     <w:p>

</xml_diff>